<commit_message>
I uploaded Parabank Research file
</commit_message>
<xml_diff>
--- a/Daily report/Kamogelo Sekhaolelo Daily Report.docx
+++ b/Daily report/Kamogelo Sekhaolelo Daily Report.docx
@@ -179,10 +179,7 @@
               <w:t>-</w:t>
             </w:r>
             <w:r>
-              <w:t>2</w:t>
-            </w:r>
-            <w:r>
-              <w:t>7</w:t>
+              <w:t>30</w:t>
             </w:r>
           </w:p>
         </w:tc>
@@ -1002,15 +999,15 @@
           </w:tcPr>
           <w:p>
             <w:r>
-              <w:t xml:space="preserve">Complete STLC Phase 1 (Discovery &amp; Requirements Analysis) deliverables for the </w:t>
+              <w:t xml:space="preserve">Master and implement TestNG automation framework concepts (Annotations, Assertions, </w:t>
             </w:r>
             <w:proofErr w:type="spellStart"/>
             <w:r>
-              <w:t>ParaBank</w:t>
+              <w:t>DataProviders</w:t>
             </w:r>
             <w:proofErr w:type="spellEnd"/>
             <w:r>
-              <w:t xml:space="preserve"> assignment.</w:t>
+              <w:t>, and testng.xml suite configuration).</w:t>
             </w:r>
           </w:p>
         </w:tc>
@@ -1071,7 +1068,7 @@
           </w:tcPr>
           <w:p>
             <w:r>
-              <w:t xml:space="preserve">Complete STLC Phase 2 (Building the Test Strategy &amp; Test Plan) deliverables for the </w:t>
+              <w:t xml:space="preserve">Complete STLC Phase 5 (Quality Investigation) deliverables for the </w:t>
             </w:r>
             <w:proofErr w:type="spellStart"/>
             <w:r>
@@ -1079,7 +1076,7 @@
             </w:r>
             <w:proofErr w:type="spellEnd"/>
             <w:r>
-              <w:t xml:space="preserve"> assignment.</w:t>
+              <w:t xml:space="preserve"> STLC assignment.</w:t>
             </w:r>
           </w:p>
         </w:tc>
@@ -1140,7 +1137,7 @@
           </w:tcPr>
           <w:p>
             <w:r>
-              <w:t>Establish complete end-to-end traceability between Phase 1 Functional Requirements and Phase 2 Scope &amp; Risk Matrices.</w:t>
+              <w:t>Execute all 50 planned test cases, capture screenshot evidence, raise detailed defect reports (DEF-001 to DEF-011), perform exploratory testing missions, and deliver the Release Risk Assessment.</w:t>
             </w:r>
           </w:p>
         </w:tc>
@@ -1278,16 +1275,8 @@
                 <w:tab w:val="left" w:pos="2730"/>
               </w:tabs>
             </w:pPr>
-            <w:proofErr w:type="spellStart"/>
-            <w:r>
-              <w:t>ParaBank</w:t>
-            </w:r>
-            <w:proofErr w:type="spellEnd"/>
-            <w:r>
-              <w:t xml:space="preserve"> STLC Phase 1 – Discovery &amp; Requirements Analys</w:t>
-            </w:r>
-            <w:r>
-              <w:t>is</w:t>
+            <w:r>
+              <w:t>TestNG Framework Tutorial &amp; Hands-on Implementation</w:t>
             </w:r>
           </w:p>
         </w:tc>
@@ -1341,15 +1330,13 @@
           </w:tcPr>
           <w:p>
             <w:r>
-              <w:t xml:space="preserve">MS Word, MS Excel, Google Chrome, </w:t>
-            </w:r>
-            <w:proofErr w:type="spellStart"/>
-            <w:r>
-              <w:t>ParaBank</w:t>
-            </w:r>
-            <w:proofErr w:type="spellEnd"/>
-            <w:r>
-              <w:t xml:space="preserve"> Web Application</w:t>
+              <w:t>Eclipse IDE, Java, TestNG Framework</w:t>
+            </w:r>
+            <w:r>
+              <w:t xml:space="preserve">, </w:t>
+            </w:r>
+            <w:r>
+              <w:t>Hard/Soft Assertions, Chrome Browser</w:t>
             </w:r>
           </w:p>
         </w:tc>
@@ -1408,13 +1395,7 @@
               </w:tabs>
             </w:pPr>
             <w:r>
-              <w:t>Successfully completed full Phase 1 documentation including Business Understanding, Module Analysis for all 10 modules, 24 testable Functional Requirements</w:t>
-            </w:r>
-            <w:r>
-              <w:t xml:space="preserve"> </w:t>
-            </w:r>
-            <w:r>
-              <w:t>(FR-REG-001 through FR-SES-002), 12 Non-Functional Requirements, User Workflows, Validation Rules, Assumptions, Risk Register, and Gap Analysis.</w:t>
+              <w:t>Successfully mastered TestNG framework capabilities, configured parameterized data-driven testing, and set up XML suite runners for automated test execution.</w:t>
             </w:r>
           </w:p>
         </w:tc>
@@ -1468,27 +1449,7 @@
           <w:sz w:val="20"/>
           <w:szCs w:val="20"/>
         </w:rPr>
-        <w:t xml:space="preserve">Conducted hands-on exploratory analysis of the </w:t>
-      </w:r>
-      <w:proofErr w:type="spellStart"/>
-      <w:r>
-        <w:rPr>
-          <w:b/>
-          <w:bCs/>
-          <w:sz w:val="20"/>
-          <w:szCs w:val="20"/>
-        </w:rPr>
-        <w:t>ParaBank</w:t>
-      </w:r>
-      <w:proofErr w:type="spellEnd"/>
-      <w:r>
-        <w:rPr>
-          <w:b/>
-          <w:bCs/>
-          <w:sz w:val="20"/>
-          <w:szCs w:val="20"/>
-        </w:rPr>
-        <w:t xml:space="preserve"> online banking application.</w:t>
+        <w:t>Configured TestNG dependencies and plugins within Eclipse IDE.</w:t>
       </w:r>
     </w:p>
     <w:p>
@@ -1525,7 +1486,25 @@
           <w:sz w:val="20"/>
           <w:szCs w:val="20"/>
         </w:rPr>
-        <w:t>Derived functional and non-functional requirements and assigned permanent module-prefixed IDs.</w:t>
+        <w:t>Implemented core TestNG annotations</w:t>
+      </w:r>
+      <w:r>
+        <w:rPr>
+          <w:b/>
+          <w:bCs/>
+          <w:sz w:val="20"/>
+          <w:szCs w:val="20"/>
+        </w:rPr>
+        <w:t xml:space="preserve"> </w:t>
+      </w:r>
+      <w:r>
+        <w:rPr>
+          <w:b/>
+          <w:bCs/>
+          <w:sz w:val="20"/>
+          <w:szCs w:val="20"/>
+        </w:rPr>
+        <w:t>to control test execution flow.</w:t>
       </w:r>
     </w:p>
     <w:p>
@@ -1562,7 +1541,7 @@
           <w:sz w:val="20"/>
           <w:szCs w:val="20"/>
         </w:rPr>
-        <w:t>Formulated user workflows, validation rules, risk registers, and stakeholder clarification questions.</w:t>
+        <w:t>Created data-driven automated tests using @DataProvider to pass multiple test data sets into test methods dynamically.</w:t>
       </w:r>
     </w:p>
     <w:p>
@@ -1891,7 +1870,7 @@
             </w:r>
             <w:proofErr w:type="spellEnd"/>
             <w:r>
-              <w:t xml:space="preserve"> STLC Phase 2 – Building the Test Strategy</w:t>
+              <w:t xml:space="preserve"> STLC Phase 5 – Quality Investigation  </w:t>
             </w:r>
           </w:p>
         </w:tc>
@@ -1945,7 +1924,7 @@
           </w:tcPr>
           <w:p>
             <w:r>
-              <w:t xml:space="preserve">MS Word, MS Excel, </w:t>
+              <w:t xml:space="preserve">MS Word, MS Excel, Chrome &amp; Edge Browsers, Developer Tools, </w:t>
             </w:r>
             <w:proofErr w:type="spellStart"/>
             <w:r>
@@ -2007,7 +1986,7 @@
           </w:tcPr>
           <w:p>
             <w:r>
-              <w:t>Successfully completed full Phase 2 Test Plan document including Scope Matrix, Test Strategy, Risk-Based Testing Matrix, Single-Resource Allocation Plan, Environment Plan, Entry/Exit Criteria, 10-day Schedule, and Trade-off Analysis.</w:t>
+              <w:t>Successfully authored the complete Phase 5 Quality Investigation pack, including Test Execution Tracker (50 test cases executed: 41 Pass, 7 Fail, 2 Blocked), Defect Report (11 defects raised), Defect Analysis Report, Exploratory Testing Report, Defect Triage, Root Cause Analysis, Defect Clustering, Defect Escape Analysis, Bug Advocacy, and a formal Release Risk Assessment.</w:t>
             </w:r>
           </w:p>
         </w:tc>
@@ -2061,7 +2040,7 @@
           <w:sz w:val="20"/>
           <w:szCs w:val="20"/>
         </w:rPr>
-        <w:t>Defined strict in-scope and out-of-scope boundaries directly mapped to Phase 1 requirement IDs.</w:t>
+        <w:t>Executed all 50 test cases from Phase 3 across Registration, Login, Open New Account, Transfer Funds, Bill Pay, and Request Loan modules.</w:t>
       </w:r>
     </w:p>
     <w:p>
@@ -2098,7 +2077,16 @@
           <w:sz w:val="20"/>
           <w:szCs w:val="20"/>
         </w:rPr>
-        <w:t>Formulated functional, negative, boundary, exploratory, and regression testing strategies.</w:t>
+        <w:t>Captured screenshot evidence for all failed/blocked test cases and defects adhering to Phase 4 evidence naming standards</w:t>
+      </w:r>
+      <w:r>
+        <w:rPr>
+          <w:b/>
+          <w:bCs/>
+          <w:sz w:val="20"/>
+          <w:szCs w:val="20"/>
+        </w:rPr>
+        <w:t>.</w:t>
       </w:r>
     </w:p>
     <w:p>
@@ -2108,7 +2096,7 @@
           <w:ilvl w:val="0"/>
           <w:numId w:val="2"/>
         </w:numPr>
-        <w:spacing w:before="30" w:after="30"/>
+        <w:spacing w:before="30" w:after="60"/>
       </w:pPr>
       <w:r>
         <w:rPr>
@@ -2135,13 +2123,17 @@
           <w:sz w:val="20"/>
           <w:szCs w:val="20"/>
         </w:rPr>
-        <w:t>Prioritized features using Risk-Based Testing (RBT) and defined measurable entry and exit criteria.</w:t>
-      </w:r>
-    </w:p>
-    <w:p>
-      <w:pPr>
-        <w:spacing w:after="60"/>
-      </w:pPr>
+        <w:t>Formulated the Test Execution Summary Report (82.0% Pass Rate) and delivered a formal RELEASE NOT RECOMMENDED recommendation due to open Critical defects</w:t>
+      </w:r>
+      <w:r>
+        <w:rPr>
+          <w:b/>
+          <w:bCs/>
+          <w:sz w:val="20"/>
+          <w:szCs w:val="20"/>
+        </w:rPr>
+        <w:t>.</w:t>
+      </w:r>
     </w:p>
     <w:p>
       <w:pPr>
@@ -2478,14 +2470,14 @@
             </w:tcMar>
           </w:tcPr>
           <w:p>
-            <w:r>
-              <w:t xml:space="preserve">Phase 3 Test Case Development for </w:t>
-            </w:r>
             <w:proofErr w:type="spellStart"/>
             <w:r>
-              <w:t>Parabank</w:t>
+              <w:t>ParaBank</w:t>
             </w:r>
             <w:proofErr w:type="spellEnd"/>
+            <w:r>
+              <w:t xml:space="preserve"> STLC Assignment – Phase 6 Quality Advisory &amp; Release Decision</w:t>
+            </w:r>
           </w:p>
         </w:tc>
       </w:tr>
@@ -2515,6 +2507,7 @@
                 <w:sz w:val="20"/>
                 <w:szCs w:val="20"/>
               </w:rPr>
+              <w:lastRenderedPageBreak/>
               <w:t>Current Status</w:t>
             </w:r>
           </w:p>
@@ -2543,7 +2536,7 @@
               </w:tabs>
             </w:pPr>
             <w:r>
-              <w:t>80% Complete, need to compile Validation, Positive and Negative, as well as Boundary Values.</w:t>
+              <w:t>Phase 5 complete; ready to commence Phase 6 quality metrics dashboard, final closure reports, and executive presentation.</w:t>
             </w:r>
           </w:p>
         </w:tc>
@@ -2597,7 +2590,10 @@
           </w:tcPr>
           <w:p>
             <w:r>
-              <w:t>Deliver a structured document and using the information from Phase 1 &amp; 2</w:t>
+              <w:t xml:space="preserve">80% </w:t>
+            </w:r>
+            <w:r>
+              <w:t>Calculate quality metrics (Requirements Coverage, Defect Density, Pass/Fail rates), draft Test Summary &amp; Closure Reports, create the Executive Presentation deck, and complete the STLC Retrospective.</w:t>
             </w:r>
           </w:p>
         </w:tc>
@@ -2628,7 +2624,6 @@
                 <w:sz w:val="20"/>
                 <w:szCs w:val="20"/>
               </w:rPr>
-              <w:lastRenderedPageBreak/>
               <w:t>Expected ETA</w:t>
             </w:r>
           </w:p>
@@ -3044,15 +3039,7 @@
           </w:tcPr>
           <w:p>
             <w:r>
-              <w:t xml:space="preserve">Learnt how to </w:t>
-            </w:r>
-            <w:proofErr w:type="spellStart"/>
-            <w:r>
-              <w:t>analyze</w:t>
-            </w:r>
-            <w:proofErr w:type="spellEnd"/>
-            <w:r>
-              <w:t xml:space="preserve"> an unfamiliar system without documentation and extract testable functional and non-functional requirements using standard FR-&lt;MODULE&gt;-### IDs.</w:t>
+              <w:t>Mastered TestNG framework architecture—specifically utilizing @DataProvider for parameterization and configuring testng.xml for batch suite execution and reporting.</w:t>
             </w:r>
           </w:p>
         </w:tc>
@@ -3113,7 +3100,7 @@
           </w:tcPr>
           <w:p>
             <w:r>
-              <w:t>Learnt the importance of maintaining single-source-of-truth requirement IDs across early STLC phases to prevent ID drift in traceability matrices.</w:t>
+              <w:t>Learned how to execute structured test suites, log reproducible defect reports with evidence, and conduct Root Cause Analysis (Coding, Design, Requirement issues) and Defect Clustering.</w:t>
             </w:r>
           </w:p>
         </w:tc>
@@ -3174,7 +3161,7 @@
           </w:tcPr>
           <w:p>
             <w:r>
-              <w:t>Learnt how to apply Risk-Based Testing (RBT) to prioritize high-impact financial modules (Transfer Funds, Bill Pay) under single-tester resource constraints.</w:t>
+              <w:t>Learned how to perform structured exploratory testing missions and articulate a business-focused Release Risk Assessment based on Critical defect impact rather than raw pass rates alone.</w:t>
             </w:r>
           </w:p>
         </w:tc>
@@ -3290,7 +3277,6 @@
                 <w:sz w:val="20"/>
                 <w:szCs w:val="20"/>
               </w:rPr>
-              <w:lastRenderedPageBreak/>
               <w:t>Meetings Attended</w:t>
             </w:r>
           </w:p>
@@ -3374,7 +3360,15 @@
           </w:tcPr>
           <w:p>
             <w:r>
-              <w:t>Review of everyone’s tasks</w:t>
+              <w:t xml:space="preserve">Reported completion of the TestNG framework tutorial and </w:t>
+            </w:r>
+            <w:proofErr w:type="spellStart"/>
+            <w:r>
+              <w:t>ParaBank</w:t>
+            </w:r>
+            <w:proofErr w:type="spellEnd"/>
+            <w:r>
+              <w:t xml:space="preserve"> Phase 5 Quality Investigation deliverables.</w:t>
             </w:r>
           </w:p>
         </w:tc>
@@ -3621,7 +3615,15 @@
           </w:tcPr>
           <w:p>
             <w:r>
-              <w:t>Delivered comprehensive documentation for both STLC Phase 1 and Phase 2 on schedule with zero requirement ID drift or logical contradictions.</w:t>
+              <w:t xml:space="preserve">Executed all 50 </w:t>
+            </w:r>
+            <w:proofErr w:type="spellStart"/>
+            <w:r>
+              <w:t>ParaBank</w:t>
+            </w:r>
+            <w:proofErr w:type="spellEnd"/>
+            <w:r>
+              <w:t xml:space="preserve"> test cases, logged 11 evidenced defect reports, performed exploratory testing missions, and mastered TestNG framework implementation.  </w:t>
             </w:r>
           </w:p>
         </w:tc>
@@ -3675,7 +3677,7 @@
           </w:tcPr>
           <w:p>
             <w:r>
-              <w:t>Timeboxing exploratory application analysis even more strictly by module.</w:t>
+              <w:t>Streamlining time spent isolating rapid-submission race conditions (DEF-007) during execution.</w:t>
             </w:r>
           </w:p>
         </w:tc>
@@ -4083,7 +4085,19 @@
               </w:tabs>
             </w:pPr>
             <w:r>
-              <w:t>Commence Phase 3 – Test Design &amp; Coverage (Test Scenarios &amp; Detailed Test Case authoring).</w:t>
+              <w:lastRenderedPageBreak/>
+              <w:t xml:space="preserve">Commence </w:t>
+            </w:r>
+            <w:proofErr w:type="spellStart"/>
+            <w:r>
+              <w:t>ParaBank</w:t>
+            </w:r>
+            <w:proofErr w:type="spellEnd"/>
+            <w:r>
+              <w:t xml:space="preserve"> STLC Phase 6 – Quality Advisory &amp; Release Decision (Metrics Dashboard, Test Summary Report, and Test Closure Report)</w:t>
+            </w:r>
+            <w:r>
+              <w:t>.</w:t>
             </w:r>
           </w:p>
         </w:tc>
@@ -4149,7 +4163,7 @@
               </w:tabs>
             </w:pPr>
             <w:r>
-              <w:t>Construct the Requirements Traceability Matrix (RTM) linking Phase 1 Requirements to Phase 3 Test Cases.</w:t>
+              <w:t>Build the Stakeholder Executive Presentation slides (8–10 slides) and write the STLC Retrospective across all 6 phases.</w:t>
             </w:r>
           </w:p>
         </w:tc>
@@ -4210,8 +4224,7 @@
           </w:tcPr>
           <w:p>
             <w:r>
-              <w:lastRenderedPageBreak/>
-              <w:t>Redo module 17 and 19 and submit to Isaac.</w:t>
+              <w:t>Integrate TestNG annotations and assertions into existing Selenium WebDriver test automation suites.</w:t>
             </w:r>
           </w:p>
         </w:tc>
@@ -4280,7 +4293,7 @@
         <w:spacing w:after="80"/>
       </w:pPr>
       <w:r>
-        <w:t>All Phase 1 and Phase 2 deliverables were prepared and checked against ISTQB and IEEE 829 standards, ensuring full traceability from requirements to test strategy.</w:t>
+        <w:t>All TestNG automation scripts were developed, debugged, and executed successfully in Eclipse IDE using Chrome Browser. All Phase 5 execution logs and defect reports maintain 100% traceability to Phase 3 Test Cases and Phase 1 Requirements.</w:t>
       </w:r>
     </w:p>
     <w:tbl>

</xml_diff>

<commit_message>
Updated documents Aug 18
</commit_message>
<xml_diff>
--- a/Daily report/Kamogelo Sekhaolelo Daily Report.docx
+++ b/Daily report/Kamogelo Sekhaolelo Daily Report.docx
@@ -179,7 +179,10 @@
               <w:t>-</w:t>
             </w:r>
             <w:r>
-              <w:t>03</w:t>
+              <w:t>1</w:t>
+            </w:r>
+            <w:r>
+              <w:t>4</w:t>
             </w:r>
           </w:p>
         </w:tc>
@@ -661,6 +664,7 @@
                   <w14:uncheckedState w14:val="2610" w14:font="MS Gothic"/>
                 </w14:checkbox>
               </w:sdtPr>
+              <w:sdtEndPr/>
               <w:sdtContent>
                 <w:r>
                   <w:rPr>
@@ -718,6 +722,7 @@
                   <w14:uncheckedState w14:val="2610" w14:font="MS Gothic"/>
                 </w14:checkbox>
               </w:sdtPr>
+              <w:sdtEndPr/>
               <w:sdtContent>
                 <w:r>
                   <w:rPr>
@@ -999,7 +1004,30 @@
           </w:tcPr>
           <w:p>
             <w:r>
-              <w:t>Master and automate TestNG grouping (Module 23 – Groups in TestNG) and execution order control (Module 24 – TestNG @Test Priority in Selenium).</w:t>
+              <w:t xml:space="preserve">My task for today is to complete </w:t>
+            </w:r>
+            <w:r>
+              <w:t xml:space="preserve">module 30 - </w:t>
+            </w:r>
+            <w:r>
+              <w:rPr>
+                <w:b/>
+                <w:bCs/>
+              </w:rPr>
+              <w:t>Custom Reports, PDF &amp; Email Reports</w:t>
+            </w:r>
+            <w:r>
+              <w:rPr>
+                <w:b/>
+                <w:bCs/>
+              </w:rPr>
+              <w:t xml:space="preserve"> </w:t>
+            </w:r>
+            <w:r>
+              <w:t>activity</w:t>
+            </w:r>
+            <w:r>
+              <w:t xml:space="preserve"> for TestNG.</w:t>
             </w:r>
           </w:p>
         </w:tc>
@@ -1059,16 +1087,28 @@
             </w:tcMar>
           </w:tcPr>
           <w:p>
-            <w:r>
-              <w:t xml:space="preserve">Complete STLC Phase 6 (Quality Advisory &amp; Release Decision) deliverables for the </w:t>
-            </w:r>
-            <w:proofErr w:type="spellStart"/>
-            <w:r>
-              <w:t>ParaBank</w:t>
-            </w:r>
-            <w:proofErr w:type="spellEnd"/>
-            <w:r>
-              <w:t xml:space="preserve"> STLC assignment</w:t>
+            <w:pPr>
+              <w:rPr>
+                <w:lang w:val="en-US"/>
+              </w:rPr>
+            </w:pPr>
+            <w:r>
+              <w:rPr>
+                <w:lang w:val="en-US"/>
+              </w:rPr>
+              <w:t xml:space="preserve">I need to review my notes on Guru99 on </w:t>
+            </w:r>
+            <w:r>
+              <w:rPr>
+                <w:color w:val="000000"/>
+              </w:rPr>
+              <w:t>Module 33 – Read &amp; Write Data from Excel File in Selenium Web driver: POI &amp; JXL</w:t>
+            </w:r>
+            <w:r>
+              <w:rPr>
+                <w:color w:val="000000"/>
+              </w:rPr>
+              <w:t>.</w:t>
             </w:r>
           </w:p>
         </w:tc>
@@ -1129,10 +1169,19 @@
           </w:tcPr>
           <w:p>
             <w:r>
-              <w:t>Synthesize the QA Metrics Dashboard, Test Summary Report, GO / NO-GO Release Recommendation, Executive Presentation Deck, and 6-Phase STLC Retrospectiv</w:t>
-            </w:r>
-            <w:r>
-              <w:t>e.</w:t>
+              <w:t xml:space="preserve">I will move to reading </w:t>
+            </w:r>
+            <w:r>
+              <w:rPr>
+                <w:color w:val="000000"/>
+              </w:rPr>
+              <w:t>Module 34 – Maven &amp; Jenkins Integration with Selenium: Complete Tutorial  (Focus Maven)</w:t>
+            </w:r>
+            <w:r>
+              <w:rPr>
+                <w:color w:val="000000"/>
+              </w:rPr>
+              <w:t xml:space="preserve"> Framework concepts.</w:t>
             </w:r>
           </w:p>
         </w:tc>
@@ -1271,7 +1320,11 @@
               </w:tabs>
             </w:pPr>
             <w:r>
-              <w:t>Module 23 (Groups in TestNG) &amp; Module 24 (TestNG @Test Priority in Selenium)</w:t>
+              <w:rPr>
+                <w:b/>
+                <w:bCs/>
+              </w:rPr>
+              <w:t>Module 30 – Custom Reports, PDF &amp; Email Reports</w:t>
             </w:r>
           </w:p>
         </w:tc>
@@ -1325,7 +1378,7 @@
           </w:tcPr>
           <w:p>
             <w:r>
-              <w:t>Eclipse IDE, Java, Selenium WebDriver, TestNG Framework, testng.xml Suite Configuration, Chrome Browser</w:t>
+              <w:t>Java, Selenium WebDriver, TestNG, Eclipse IDE, Edge Browser</w:t>
             </w:r>
           </w:p>
         </w:tc>
@@ -1384,7 +1437,7 @@
               </w:tabs>
             </w:pPr>
             <w:r>
-              <w:t>Successfully implemented TestNG test grouping to execute targeted suite subsets (e.g., Smoke vs. Regression) and configured @Test priority parameters to control the precise execution sequencing of automated Selenium test methods.</w:t>
+              <w:t>Test cases run 5: Passed 3, Failed 1, Skipped 1</w:t>
             </w:r>
           </w:p>
         </w:tc>
@@ -1438,7 +1491,7 @@
           <w:sz w:val="20"/>
           <w:szCs w:val="20"/>
         </w:rPr>
-        <w:t>Module 23 (Groups in TestNG): Categorized test methods into functional groups using @Test(groups = {"smoke", "regression", "sanity"}).</w:t>
+        <w:t>Programmed runtime tracking variables (passedTests, failedTests, skippedTests, duration) inside @BeforeClass, @Test, and @AfterClass blocks.</w:t>
       </w:r>
     </w:p>
     <w:p>
@@ -1475,7 +1528,7 @@
           <w:sz w:val="20"/>
           <w:szCs w:val="20"/>
         </w:rPr>
-        <w:t>Configured the testng.xml file with &lt;groups&gt;&lt;run&gt;&lt;include name="smoke"/&gt;&lt;/run&gt;&lt;/groups&gt; tags to trigger specific group subsets dynamically without modifying Java code.</w:t>
+        <w:t>Created a custom method to write execution metrics into a clean summary document (Executive_Test_Summary.txt).</w:t>
       </w:r>
     </w:p>
     <w:p>
@@ -1485,7 +1538,7 @@
           <w:ilvl w:val="0"/>
           <w:numId w:val="2"/>
         </w:numPr>
-        <w:spacing w:before="30" w:after="60"/>
+        <w:spacing w:before="60" w:after="40"/>
       </w:pPr>
       <w:r>
         <w:rPr>
@@ -1494,7 +1547,6 @@
           <w:sz w:val="20"/>
           <w:szCs w:val="20"/>
         </w:rPr>
-        <w:lastRenderedPageBreak/>
         <w:t>Step 3:</w:t>
       </w:r>
       <w:r>
@@ -1513,60 +1565,43 @@
           <w:sz w:val="20"/>
           <w:szCs w:val="20"/>
         </w:rPr>
-        <w:t>Module 24 (TestNG @Test Priority): Applied priority parameters (priority = 0, priority = 1, negative priorities) to dictate explicit execution order across multiple test methods.</w:t>
-      </w:r>
-    </w:p>
-    <w:p>
-      <w:pPr>
-        <w:pStyle w:val="ListParagraph"/>
-        <w:numPr>
-          <w:ilvl w:val="0"/>
-          <w:numId w:val="2"/>
-        </w:numPr>
-        <w:spacing w:before="30" w:after="60"/>
-      </w:pPr>
-      <w:r>
-        <w:rPr>
-          <w:b/>
-          <w:bCs/>
-          <w:sz w:val="20"/>
-          <w:szCs w:val="20"/>
-        </w:rPr>
-        <w:t xml:space="preserve">Step 4: </w:t>
-      </w:r>
-      <w:r>
-        <w:rPr>
-          <w:b/>
-          <w:bCs/>
-          <w:sz w:val="20"/>
-          <w:szCs w:val="20"/>
-        </w:rPr>
-        <w:t xml:space="preserve">Verified default TestNG </w:t>
-      </w:r>
-      <w:proofErr w:type="spellStart"/>
-      <w:r>
-        <w:rPr>
-          <w:b/>
-          <w:bCs/>
-          <w:sz w:val="20"/>
-          <w:szCs w:val="20"/>
-        </w:rPr>
-        <w:t>behavior</w:t>
-      </w:r>
-      <w:proofErr w:type="spellEnd"/>
-      <w:r>
-        <w:rPr>
-          <w:b/>
-          <w:bCs/>
-          <w:sz w:val="20"/>
-          <w:szCs w:val="20"/>
-        </w:rPr>
-        <w:t xml:space="preserve"> (alphabetical execution when priority is omitted) and validated how priority overrides default method sequencing during automated execution runs.</w:t>
+        <w:t>Drafted a formal email to management highlighting the failed test case, root cause, and release verdict (NOT READY FOR RELEASE).</w:t>
       </w:r>
     </w:p>
     <w:p>
       <w:pPr>
         <w:spacing w:before="60" w:after="40"/>
+      </w:pPr>
+    </w:p>
+    <w:p>
+      <w:pPr>
+        <w:spacing w:before="60" w:after="40"/>
+      </w:pPr>
+    </w:p>
+    <w:p>
+      <w:pPr>
+        <w:spacing w:before="60" w:after="40"/>
+      </w:pPr>
+    </w:p>
+    <w:p>
+      <w:pPr>
+        <w:spacing w:before="60" w:after="40"/>
+      </w:pPr>
+    </w:p>
+    <w:p>
+      <w:pPr>
+        <w:spacing w:before="60" w:after="40"/>
+      </w:pPr>
+    </w:p>
+    <w:p>
+      <w:pPr>
+        <w:spacing w:before="60" w:after="40"/>
+      </w:pPr>
+    </w:p>
+    <w:p>
+      <w:pPr>
+        <w:spacing w:before="60" w:after="40"/>
+        <w:ind w:left="180"/>
       </w:pPr>
       <w:r>
         <w:rPr>
@@ -1631,11 +1666,12 @@
                 </w:rPr>
                 <w:id w:val="132536344"/>
                 <w14:checkbox>
-                  <w14:checked w14:val="1"/>
+                  <w14:checked w14:val="0"/>
                   <w14:checkedState w14:val="2612" w14:font="MS Gothic"/>
                   <w14:uncheckedState w14:val="2610" w14:font="MS Gothic"/>
                 </w14:checkbox>
               </w:sdtPr>
+              <w:sdtEndPr/>
               <w:sdtContent>
                 <w:r>
                   <w:rPr>
@@ -1644,7 +1680,7 @@
                     <w:sz w:val="20"/>
                     <w:szCs w:val="20"/>
                   </w:rPr>
-                  <w:t>☒</w:t>
+                  <w:t>☐</w:t>
                 </w:r>
               </w:sdtContent>
             </w:sdt>
@@ -1688,11 +1724,12 @@
                 </w:rPr>
                 <w:id w:val="1673294260"/>
                 <w14:checkbox>
-                  <w14:checked w14:val="0"/>
+                  <w14:checked w14:val="1"/>
                   <w14:checkedState w14:val="2612" w14:font="MS Gothic"/>
                   <w14:uncheckedState w14:val="2610" w14:font="MS Gothic"/>
                 </w14:checkbox>
               </w:sdtPr>
+              <w:sdtEndPr/>
               <w:sdtContent>
                 <w:r>
                   <w:rPr>
@@ -1701,7 +1738,7 @@
                     <w:sz w:val="20"/>
                     <w:szCs w:val="20"/>
                   </w:rPr>
-                  <w:t>☐</w:t>
+                  <w:t>☒</w:t>
                 </w:r>
               </w:sdtContent>
             </w:sdt>
@@ -1750,6 +1787,7 @@
                   <w14:uncheckedState w14:val="2610" w14:font="MS Gothic"/>
                 </w14:checkbox>
               </w:sdtPr>
+              <w:sdtEndPr/>
               <w:sdtContent>
                 <w:r>
                   <w:rPr>
@@ -1884,13 +1922,8 @@
             </w:tcMar>
           </w:tcPr>
           <w:p>
-            <w:proofErr w:type="spellStart"/>
-            <w:r>
-              <w:t>ParaBank</w:t>
-            </w:r>
-            <w:proofErr w:type="spellEnd"/>
-            <w:r>
-              <w:t xml:space="preserve"> STLC Phase 6 – Quality Advisory &amp; Release Decision</w:t>
+            <w:r>
+              <w:t>Module 29 – TestNG Report Generation</w:t>
             </w:r>
           </w:p>
         </w:tc>
@@ -1944,15 +1977,7 @@
           </w:tcPr>
           <w:p>
             <w:r>
-              <w:t xml:space="preserve">MS Word, MS Excel, MS PowerPoint, Chrome &amp; Edge Browsers, Developer Tools, </w:t>
-            </w:r>
-            <w:proofErr w:type="spellStart"/>
-            <w:r>
-              <w:t>ParaBank</w:t>
-            </w:r>
-            <w:proofErr w:type="spellEnd"/>
-            <w:r>
-              <w:t xml:space="preserve"> Web Application</w:t>
+              <w:t>Java, Selenium WebDriver, TestNG, HTML Reports, Eclipse IDE</w:t>
             </w:r>
           </w:p>
         </w:tc>
@@ -2006,7 +2031,7 @@
           </w:tcPr>
           <w:p>
             <w:r>
-              <w:t>Successfully authored the complete Phase 6 Quality Advisory &amp; Release Decision deliverable pack, including QA Metrics Dashboard, Defect Analysis Report, Quality Risk Assessment, formal Test Summary Report, evidence-based GO / NO-GO Release Recommendation, Test Closure Report, Executive Presentation (10 slides), Quality Maturity Assessment, Production Impact Analysis, Executive Communication Reports, and the 6-Phase STLC Retrospective.</w:t>
+              <w:t>Executed a 10-case regression suite, analyzed HTML reports, and generated a formal Executive Summary report for management.</w:t>
             </w:r>
           </w:p>
         </w:tc>
@@ -2060,7 +2085,7 @@
           <w:sz w:val="20"/>
           <w:szCs w:val="20"/>
         </w:rPr>
-        <w:t>Calculated final quality metrics: Requirements Coverage (75.0% combined, 90.0% functional), Test Case Pass Rate (82.0%), Fail Rate (14.0%), Blocked Rate (4.0%), and Defect Density (0.22 defects/test case).</w:t>
+        <w:t>Built a regression test class with 10 test cases (8 passed, 1 failed, 1 skipped due to dependencies).</w:t>
       </w:r>
     </w:p>
     <w:p>
@@ -2097,7 +2122,7 @@
           <w:sz w:val="20"/>
           <w:szCs w:val="20"/>
         </w:rPr>
-        <w:t>Drafted a 2-page evidence-based NO-GO Release Recommendation detailing financial, customer, and reputational risks, supported by specific defect metrics.</w:t>
+        <w:t>Ran the suite XML and extracted metrics from test-output/emailable-report.html (80% pass rate, 24.8s total duration).</w:t>
       </w:r>
     </w:p>
     <w:p>
@@ -2107,7 +2132,7 @@
           <w:ilvl w:val="0"/>
           <w:numId w:val="2"/>
         </w:numPr>
-        <w:spacing w:before="60" w:after="40"/>
+        <w:spacing w:before="30" w:after="30"/>
       </w:pPr>
       <w:r>
         <w:rPr>
@@ -2134,13 +2159,13 @@
           <w:sz w:val="20"/>
           <w:szCs w:val="20"/>
         </w:rPr>
-        <w:t>Developed an 8–10 slide Executive Presentation deck tailored for C-level executives, Project Managers, and Development Leads.</w:t>
+        <w:t>Documented the failure root cause (NoSuchElementException) and authored a one-page execution summary report.</w:t>
       </w:r>
     </w:p>
     <w:p>
       <w:pPr>
         <w:spacing w:before="60" w:after="40"/>
-        <w:ind w:left="180"/>
+        <w:ind w:left="-180"/>
       </w:pPr>
       <w:r>
         <w:rPr>
@@ -2219,6 +2244,7 @@
                   <w14:uncheckedState w14:val="2610" w14:font="MS Gothic"/>
                 </w14:checkbox>
               </w:sdtPr>
+              <w:sdtEndPr/>
               <w:sdtContent>
                 <w:r>
                   <w:rPr>
@@ -2276,6 +2302,7 @@
                   <w14:uncheckedState w14:val="2610" w14:font="MS Gothic"/>
                 </w14:checkbox>
               </w:sdtPr>
+              <w:sdtEndPr/>
               <w:sdtContent>
                 <w:r>
                   <w:rPr>
@@ -2333,6 +2360,7 @@
                   <w14:uncheckedState w14:val="2610" w14:font="MS Gothic"/>
                 </w14:checkbox>
               </w:sdtPr>
+              <w:sdtEndPr/>
               <w:sdtContent>
                 <w:r>
                   <w:rPr>
@@ -2396,7 +2424,6 @@
           <w:sz w:val="19"/>
           <w:szCs w:val="19"/>
         </w:rPr>
-        <w:lastRenderedPageBreak/>
         <w:t>Tasks started but not yet completed.</w:t>
       </w:r>
     </w:p>
@@ -2475,7 +2502,7 @@
           </w:tcPr>
           <w:p>
             <w:r>
-              <w:t>N/A</w:t>
+              <w:t>Complete Guru99 Selenium Frameworks: 4 Topics.</w:t>
             </w:r>
           </w:p>
         </w:tc>
@@ -2506,6 +2533,7 @@
                 <w:sz w:val="20"/>
                 <w:szCs w:val="20"/>
               </w:rPr>
+              <w:lastRenderedPageBreak/>
               <w:t>Current Status</w:t>
             </w:r>
           </w:p>
@@ -2534,7 +2562,37 @@
               </w:tabs>
             </w:pPr>
             <w:r>
-              <w:t>N/A</w:t>
+              <w:t>8</w:t>
+            </w:r>
+            <w:r>
+              <w:t>0</w:t>
+            </w:r>
+            <w:r>
+              <w:t xml:space="preserve">% </w:t>
+            </w:r>
+            <w:r>
+              <w:t xml:space="preserve">I finished reading through </w:t>
+            </w:r>
+            <w:r>
+              <w:rPr>
+                <w:color w:val="000000"/>
+              </w:rPr>
+              <w:t>Module 33 – Read &amp; Write Data from Excel File in Selenium Web driver: POI &amp; JXL </w:t>
+            </w:r>
+            <w:r>
+              <w:t>in TestNG</w:t>
+            </w:r>
+            <w:r>
+              <w:t xml:space="preserve"> of Frameworks, </w:t>
+            </w:r>
+            <w:r>
+              <w:t xml:space="preserve">which is the </w:t>
+            </w:r>
+            <w:r>
+              <w:t>second</w:t>
+            </w:r>
+            <w:r>
+              <w:t xml:space="preserve"> topic.</w:t>
             </w:r>
           </w:p>
         </w:tc>
@@ -2588,7 +2646,7 @@
           </w:tcPr>
           <w:p>
             <w:r>
-              <w:t>N/A</w:t>
+              <w:t>Do a final directory clean-up and submit the full package via email.</w:t>
             </w:r>
           </w:p>
         </w:tc>
@@ -2642,7 +2700,16 @@
           </w:tcPr>
           <w:p>
             <w:r>
-              <w:t>N/A</w:t>
+              <w:t>14</w:t>
+            </w:r>
+            <w:r>
+              <w:t xml:space="preserve"> August 2026</w:t>
+            </w:r>
+            <w:r>
+              <w:t xml:space="preserve"> </w:t>
+            </w:r>
+            <w:r>
+              <w:t>(End of day)</w:t>
             </w:r>
           </w:p>
         </w:tc>
@@ -3034,7 +3101,7 @@
           </w:tcPr>
           <w:p>
             <w:r>
-              <w:t>Mastered TestNG grouping (groups = {"smoke"}) to filter and execute specific test case categories dynamically via testng.xml XML suite files.</w:t>
+              <w:t>I learned how to extract live metrics during suite execution to auto-generate custom executive reports and present high-level release readiness decisions to project stakeholders.</w:t>
             </w:r>
           </w:p>
         </w:tc>
@@ -3095,7 +3162,7 @@
           </w:tcPr>
           <w:p>
             <w:r>
-              <w:t>Learned how to control Selenium test method execution sequence using @Test(priority = x) attributes and understood default alphabetical ordering rules.</w:t>
+              <w:t>I learned the two core strategies for automating dynamic web calendars: directly clearing/sending formatted date strings versus dynamically interacting with dynamic UI calendar controls using conditional loops.</w:t>
             </w:r>
           </w:p>
         </w:tc>
@@ -3156,8 +3223,7 @@
           </w:tcPr>
           <w:p>
             <w:r>
-              <w:lastRenderedPageBreak/>
-              <w:t>Learned how to formulate an executive-level NO-GO release recommendation based on residual business risk, financial impact, and quality metrics rather than raw pass rates alone.</w:t>
+              <w:t>I gained practical experience in translating technical automation stack traces into clear, actionable summary emails for management.</w:t>
             </w:r>
           </w:p>
         </w:tc>
@@ -3356,15 +3422,7 @@
           </w:tcPr>
           <w:p>
             <w:r>
-              <w:t xml:space="preserve">Reported completion of the TestNG framework tutorial and </w:t>
-            </w:r>
-            <w:proofErr w:type="spellStart"/>
-            <w:r>
-              <w:t>ParaBank</w:t>
-            </w:r>
-            <w:proofErr w:type="spellEnd"/>
-            <w:r>
-              <w:t xml:space="preserve"> Phase 5 Quality Investigation deliverables.</w:t>
+              <w:t>All interns were present and shared progress.</w:t>
             </w:r>
           </w:p>
         </w:tc>
@@ -3611,7 +3669,7 @@
           </w:tcPr>
           <w:p>
             <w:r>
-              <w:t>Delivered the complete STLC Phase 6 closure pack with full mathematical reconciliation across all 6 phases and successfully automated TestNG grouping and priority sequencing challenges.</w:t>
+              <w:t>Completed Module 30, mastered calendar/date-picker automation, and completed the full series of TestNG modules assigned for the week on schedule.</w:t>
             </w:r>
           </w:p>
         </w:tc>
@@ -3665,7 +3723,7 @@
           </w:tcPr>
           <w:p>
             <w:r>
-              <w:t>Managing execution dependencies when test methods depend on prioritized predecessor tests.</w:t>
+              <w:t>Continue refining reusable helper methods for UI controls like date pickers to reduce code duplication.</w:t>
             </w:r>
           </w:p>
         </w:tc>
@@ -3750,6 +3808,7 @@
                   <w14:uncheckedState w14:val="2610" w14:font="MS Gothic"/>
                 </w14:checkbox>
               </w:sdtPr>
+              <w:sdtEndPr/>
               <w:sdtContent>
                 <w:r>
                   <w:rPr>
@@ -3869,6 +3928,7 @@
                   <w14:uncheckedState w14:val="2610" w14:font="MS Gothic"/>
                 </w14:checkbox>
               </w:sdtPr>
+              <w:sdtEndPr/>
               <w:sdtContent>
                 <w:r>
                   <w:rPr>
@@ -3926,6 +3986,7 @@
                   <w14:uncheckedState w14:val="2610" w14:font="MS Gothic"/>
                 </w14:checkbox>
               </w:sdtPr>
+              <w:sdtEndPr/>
               <w:sdtContent>
                 <w:r>
                   <w:rPr>
@@ -4025,7 +4086,6 @@
           <w:sz w:val="20"/>
           <w:szCs w:val="20"/>
         </w:rPr>
-        <w:lastRenderedPageBreak/>
         <w:t>Task 1</w:t>
       </w:r>
     </w:p>
@@ -4074,15 +4134,7 @@
               </w:tabs>
             </w:pPr>
             <w:r>
-              <w:t xml:space="preserve">Compile and archive the complete </w:t>
-            </w:r>
-            <w:proofErr w:type="spellStart"/>
-            <w:r>
-              <w:t>ParaBank</w:t>
-            </w:r>
-            <w:proofErr w:type="spellEnd"/>
-            <w:r>
-              <w:t xml:space="preserve"> STLC Portfolio (Phases 1 through 6) for final project submission.  </w:t>
+              <w:t>Submit the complete TestNG codebase (Modules 22 to 30) and report documentation to Isaac Mahlangu, Mbewu, and Joreto.</w:t>
             </w:r>
           </w:p>
         </w:tc>
@@ -4100,6 +4152,7 @@
           <w:sz w:val="20"/>
           <w:szCs w:val="20"/>
         </w:rPr>
+        <w:lastRenderedPageBreak/>
         <w:t>Task 2</w:t>
       </w:r>
     </w:p>
@@ -4143,12 +4196,46 @@
           </w:tcPr>
           <w:p>
             <w:pPr>
-              <w:tabs>
-                <w:tab w:val="left" w:pos="1005"/>
-              </w:tabs>
+              <w:spacing w:after="0" w:line="240" w:lineRule="auto"/>
+              <w:rPr>
+                <w:color w:val="000000"/>
+              </w:rPr>
             </w:pPr>
             <w:r>
-              <w:t>Advance to framework integration modules (Extent Reports &amp; Jenkins CI/CD Pipeline integration).</w:t>
+              <w:rPr>
+                <w:color w:val="000000"/>
+              </w:rPr>
+              <w:t xml:space="preserve">Review feedback on submitted </w:t>
+            </w:r>
+            <w:r>
+              <w:rPr>
+                <w:color w:val="000000"/>
+              </w:rPr>
+              <w:t>Parabank Assignment sent b</w:t>
+            </w:r>
+            <w:r>
+              <w:rPr>
+                <w:color w:val="000000"/>
+              </w:rPr>
+              <w:t>y Isaac</w:t>
+            </w:r>
+            <w:r>
+              <w:rPr>
+                <w:color w:val="000000"/>
+              </w:rPr>
+              <w:t xml:space="preserve"> and apply any required</w:t>
+            </w:r>
+            <w:r>
+              <w:rPr>
+                <w:color w:val="000000"/>
+              </w:rPr>
+              <w:t xml:space="preserve"> concepts where applicable</w:t>
+            </w:r>
+            <w:r>
+              <w:rPr>
+                <w:color w:val="000000"/>
+              </w:rPr>
+              <w:t>.</w:t>
             </w:r>
           </w:p>
         </w:tc>
@@ -4208,8 +4295,22 @@
             </w:tcMar>
           </w:tcPr>
           <w:p>
-            <w:r>
-              <w:t>Prepare for the final project presentation and review session with Isaac Mahlangu.</w:t>
+            <w:pPr>
+              <w:rPr>
+                <w:lang w:val="en-US"/>
+              </w:rPr>
+            </w:pPr>
+            <w:r>
+              <w:rPr>
+                <w:lang w:val="en-US"/>
+              </w:rPr>
+              <w:t>Begin reading Advanced WebDriver</w:t>
+            </w:r>
+            <w:r>
+              <w:rPr>
+                <w:lang w:val="en-US"/>
+              </w:rPr>
+              <w:t xml:space="preserve"> modules on Guru99</w:t>
             </w:r>
           </w:p>
         </w:tc>
@@ -4278,7 +4379,13 @@
         <w:spacing w:after="80"/>
       </w:pPr>
       <w:r>
-        <w:t>All automation scripts for Modules 23 &amp; 24 were developed, debugged, and executed in Eclipse IDE using TestNG on Chrome Browser. All Phase 6 closure reports and metrics align 100% with Phase 1–5 project artifacts.</w:t>
+        <w:t xml:space="preserve">Submit modules 22 to 30 activities for TestNG, and finish reading </w:t>
+      </w:r>
+      <w:r>
+        <w:t>through Frameworks Concepts on Guru99 Before end of business day</w:t>
+      </w:r>
+      <w:r>
+        <w:t>.</w:t>
       </w:r>
     </w:p>
     <w:tbl>
@@ -4492,33 +4599,8 @@
                 <w:sz w:val="20"/>
                 <w:szCs w:val="20"/>
               </w:rPr>
-              <w:t xml:space="preserve"> CC Isaac , </w:t>
-            </w:r>
-            <w:proofErr w:type="spellStart"/>
-            <w:r>
-              <w:rPr>
-                <w:sz w:val="20"/>
-                <w:szCs w:val="20"/>
-              </w:rPr>
-              <w:t>Mbewu</w:t>
-            </w:r>
-            <w:proofErr w:type="spellEnd"/>
-            <w:r>
-              <w:rPr>
-                <w:sz w:val="20"/>
-                <w:szCs w:val="20"/>
-              </w:rPr>
-              <w:t xml:space="preserve"> and </w:t>
-            </w:r>
-            <w:proofErr w:type="spellStart"/>
-            <w:r>
-              <w:rPr>
-                <w:sz w:val="20"/>
-                <w:szCs w:val="20"/>
-              </w:rPr>
-              <w:t>Joreto</w:t>
-            </w:r>
-            <w:proofErr w:type="spellEnd"/>
+              <w:t xml:space="preserve"> CC Isaac , Mbewu and Joreto</w:t>
+            </w:r>
           </w:p>
         </w:tc>
       </w:tr>
@@ -5703,6 +5785,19 @@
       <w:color w:val="1F2D3D"/>
     </w:rPr>
   </w:style>
+  <w:style w:type="paragraph" w:styleId="NormalWeb">
+    <w:name w:val="Normal (Web)"/>
+    <w:basedOn w:val="Normal"/>
+    <w:uiPriority w:val="99"/>
+    <w:semiHidden/>
+    <w:unhideWhenUsed/>
+    <w:rsid w:val="00574D1D"/>
+    <w:rPr>
+      <w:rFonts w:ascii="Times New Roman" w:hAnsi="Times New Roman" w:cs="Times New Roman"/>
+      <w:sz w:val="24"/>
+      <w:szCs w:val="24"/>
+    </w:rPr>
+  </w:style>
 </w:styles>
 </file>
 
@@ -6002,21 +6097,15 @@
 </file>
 
 <file path=customXml/item1.xml><?xml version="1.0" encoding="utf-8"?>
-<b:Sources xmlns:b="http://schemas.openxmlformats.org/officeDocument/2006/bibliography" xmlns="http://schemas.openxmlformats.org/officeDocument/2006/bibliography" SelectedStyle="\APASixthEditionOfficeOnline.xsl" StyleName="APA" Version="6"/>
+<?mso-contentType ?>
+<FormTemplates xmlns="http://schemas.microsoft.com/sharepoint/v3/contenttype/forms">
+  <Display>DocumentLibraryForm</Display>
+  <Edit>DocumentLibraryForm</Edit>
+  <New>DocumentLibraryForm</New>
+</FormTemplates>
 </file>
 
 <file path=customXml/item2.xml><?xml version="1.0" encoding="utf-8"?>
-<p:properties xmlns:p="http://schemas.microsoft.com/office/2006/metadata/properties" xmlns:xsi="http://www.w3.org/2001/XMLSchema-instance" xmlns:pc="http://schemas.microsoft.com/office/infopath/2007/PartnerControls">
-  <documentManagement>
-    <TaxCatchAll xmlns="497a9c7c-cace-4927-8a6b-eb20f26ef89f" xsi:nil="true"/>
-    <lcf76f155ced4ddcb4097134ff3c332f xmlns="81d4734a-bd62-4232-8c6b-6f62293b1d9c">
-      <Terms xmlns="http://schemas.microsoft.com/office/infopath/2007/PartnerControls"/>
-    </lcf76f155ced4ddcb4097134ff3c332f>
-  </documentManagement>
-</p:properties>
-</file>
-
-<file path=customXml/item3.xml><?xml version="1.0" encoding="utf-8"?>
 <ct:contentTypeSchema xmlns:ct="http://schemas.microsoft.com/office/2006/metadata/contentType" xmlns:ma="http://schemas.microsoft.com/office/2006/metadata/properties/metaAttributes" ct:_="" ma:_="" ma:contentTypeName="Document" ma:contentTypeID="0x010100BF6D21393CFC104985B26A2F81CCFFF4" ma:contentTypeVersion="10" ma:contentTypeDescription="Create a new document." ma:contentTypeScope="" ma:versionID="2b8ffcae116555723ff7a0ba1b79a9a3">
   <xsd:schema xmlns:xsd="http://www.w3.org/2001/XMLSchema" xmlns:xs="http://www.w3.org/2001/XMLSchema" xmlns:p="http://schemas.microsoft.com/office/2006/metadata/properties" xmlns:ns2="81d4734a-bd62-4232-8c6b-6f62293b1d9c" xmlns:ns3="497a9c7c-cace-4927-8a6b-eb20f26ef89f" targetNamespace="http://schemas.microsoft.com/office/2006/metadata/properties" ma:root="true" ma:fieldsID="dc3bbd4156bfdb48336ec1ce0dc72c89" ns2:_="" ns3:_="">
     <xsd:import namespace="81d4734a-bd62-4232-8c6b-6f62293b1d9c"/>
@@ -6205,35 +6294,30 @@
 </ct:contentTypeSchema>
 </file>
 
+<file path=customXml/item3.xml><?xml version="1.0" encoding="utf-8"?>
+<p:properties xmlns:p="http://schemas.microsoft.com/office/2006/metadata/properties" xmlns:xsi="http://www.w3.org/2001/XMLSchema-instance" xmlns:pc="http://schemas.microsoft.com/office/infopath/2007/PartnerControls">
+  <documentManagement>
+    <TaxCatchAll xmlns="497a9c7c-cace-4927-8a6b-eb20f26ef89f" xsi:nil="true"/>
+    <lcf76f155ced4ddcb4097134ff3c332f xmlns="81d4734a-bd62-4232-8c6b-6f62293b1d9c">
+      <Terms xmlns="http://schemas.microsoft.com/office/infopath/2007/PartnerControls"/>
+    </lcf76f155ced4ddcb4097134ff3c332f>
+  </documentManagement>
+</p:properties>
+</file>
+
 <file path=customXml/item4.xml><?xml version="1.0" encoding="utf-8"?>
-<?mso-contentType ?>
-<FormTemplates xmlns="http://schemas.microsoft.com/sharepoint/v3/contenttype/forms">
-  <Display>DocumentLibraryForm</Display>
-  <Edit>DocumentLibraryForm</Edit>
-  <New>DocumentLibraryForm</New>
-</FormTemplates>
+<b:Sources xmlns:b="http://schemas.openxmlformats.org/officeDocument/2006/bibliography" xmlns="http://schemas.openxmlformats.org/officeDocument/2006/bibliography" SelectedStyle="\APASixthEditionOfficeOnline.xsl" StyleName="APA" Version="6"/>
 </file>
 
 <file path=customXml/itemProps1.xml><?xml version="1.0" encoding="utf-8"?>
-<ds:datastoreItem xmlns:ds="http://schemas.openxmlformats.org/officeDocument/2006/customXml" ds:itemID="{A46A13B7-3DF5-42FB-9864-F08FF24BD99C}">
+<ds:datastoreItem xmlns:ds="http://schemas.openxmlformats.org/officeDocument/2006/customXml" ds:itemID="{0139334D-64B5-4709-A0F2-0F2EEF24B7C0}">
   <ds:schemaRefs>
-    <ds:schemaRef ds:uri="http://schemas.openxmlformats.org/officeDocument/2006/bibliography"/>
+    <ds:schemaRef ds:uri="http://schemas.microsoft.com/sharepoint/v3/contenttype/forms"/>
   </ds:schemaRefs>
 </ds:datastoreItem>
 </file>
 
 <file path=customXml/itemProps2.xml><?xml version="1.0" encoding="utf-8"?>
-<ds:datastoreItem xmlns:ds="http://schemas.openxmlformats.org/officeDocument/2006/customXml" ds:itemID="{C7F9A3AA-7896-4435-8C12-E99DB1B197E1}">
-  <ds:schemaRefs>
-    <ds:schemaRef ds:uri="http://schemas.microsoft.com/office/2006/metadata/properties"/>
-    <ds:schemaRef ds:uri="http://schemas.microsoft.com/office/infopath/2007/PartnerControls"/>
-    <ds:schemaRef ds:uri="497a9c7c-cace-4927-8a6b-eb20f26ef89f"/>
-    <ds:schemaRef ds:uri="81d4734a-bd62-4232-8c6b-6f62293b1d9c"/>
-  </ds:schemaRefs>
-</ds:datastoreItem>
-</file>
-
-<file path=customXml/itemProps3.xml><?xml version="1.0" encoding="utf-8"?>
 <ds:datastoreItem xmlns:ds="http://schemas.openxmlformats.org/officeDocument/2006/customXml" ds:itemID="{BD8E5476-0023-4D6C-8CB8-2DA09005B967}">
   <ds:schemaRefs>
     <ds:schemaRef ds:uri="http://schemas.microsoft.com/office/2006/metadata/contentType"/>
@@ -6252,10 +6336,21 @@
 </ds:datastoreItem>
 </file>
 
+<file path=customXml/itemProps3.xml><?xml version="1.0" encoding="utf-8"?>
+<ds:datastoreItem xmlns:ds="http://schemas.openxmlformats.org/officeDocument/2006/customXml" ds:itemID="{C7F9A3AA-7896-4435-8C12-E99DB1B197E1}">
+  <ds:schemaRefs>
+    <ds:schemaRef ds:uri="http://schemas.microsoft.com/office/2006/metadata/properties"/>
+    <ds:schemaRef ds:uri="http://schemas.microsoft.com/office/infopath/2007/PartnerControls"/>
+    <ds:schemaRef ds:uri="497a9c7c-cace-4927-8a6b-eb20f26ef89f"/>
+    <ds:schemaRef ds:uri="81d4734a-bd62-4232-8c6b-6f62293b1d9c"/>
+  </ds:schemaRefs>
+</ds:datastoreItem>
+</file>
+
 <file path=customXml/itemProps4.xml><?xml version="1.0" encoding="utf-8"?>
-<ds:datastoreItem xmlns:ds="http://schemas.openxmlformats.org/officeDocument/2006/customXml" ds:itemID="{0139334D-64B5-4709-A0F2-0F2EEF24B7C0}">
+<ds:datastoreItem xmlns:ds="http://schemas.openxmlformats.org/officeDocument/2006/customXml" ds:itemID="{A46A13B7-3DF5-42FB-9864-F08FF24BD99C}">
   <ds:schemaRefs>
-    <ds:schemaRef ds:uri="http://schemas.microsoft.com/sharepoint/v3/contenttype/forms"/>
+    <ds:schemaRef ds:uri="http://schemas.openxmlformats.org/officeDocument/2006/bibliography"/>
   </ds:schemaRefs>
 </ds:datastoreItem>
 </file>
</xml_diff>